<commit_message>
Preenche os dados finais do contrato de locação Turano
Contrato nº 02/2026, assinado em 14/10/2026. A locatária passa a ser
representada por Guilherme Trindade Turano, também fiador, e o aluguel é
depositado no Sicoob Engecred, agência 3299, conta 46052-4. As assinaturas
de testemunhas foram retiradas a pedido, e o fecho deixa de mencioná-las.

Co-Authored-By: Claude Opus 5.5 <noreply@anthropic.com>
Claude-Session: https://claude.ai/code/session_01QmJkyFBvaZw2weqiJS9pRm
</commit_message>
<xml_diff>
--- a/contratos/locacao-galpao-turano/Contrato de locacao - Galpao Rua Panama 158 - Turano Construtora.docx
+++ b/contratos/locacao-galpao-turano/Contrato de locacao - Galpao Rua Panama 158 - Turano Construtora.docx
@@ -32,7 +32,7 @@
           <w:szCs w:val="14"/>
           <w:spacing w:val="30"/>
         </w:rPr>
-        <w:t xml:space="preserve">IMÓVEIS PRÓPRIOS  ·  CONTRATO Nº [000/2026]</w:t>
+        <w:t xml:space="preserve">IMÓVEIS PRÓPRIOS  ·  CONTRATO Nº 02/2026</w:t>
       </w:r>
     </w:p>
     <w:p>
@@ -353,7 +353,7 @@
                 <w:sz w:val="15"/>
                 <w:szCs w:val="15"/>
               </w:rPr>
-              <w:t xml:space="preserve">TELEFONE DA LOCATÁRIA</w:t>
+              <w:t xml:space="preserve">REPRESENTANTE DA LOCATÁRIA</w:t>
             </w:r>
           </w:p>
         </w:tc>
@@ -374,7 +374,7 @@
                 <w:sz w:val="18"/>
                 <w:szCs w:val="18"/>
               </w:rPr>
-              <w:t xml:space="preserve">(38) 98411-5441</w:t>
+              <w:t xml:space="preserve">Guilherme Trindade Turano — CPF 011.689.716-23 — RG MG 615819613</w:t>
             </w:r>
           </w:p>
         </w:tc>
@@ -397,7 +397,7 @@
                 <w:sz w:val="15"/>
                 <w:szCs w:val="15"/>
               </w:rPr>
-              <w:t xml:space="preserve">FIADOR</w:t>
+              <w:t xml:space="preserve">TELEFONE DA LOCATÁRIA</w:t>
             </w:r>
           </w:p>
         </w:tc>
@@ -418,7 +418,7 @@
                 <w:sz w:val="18"/>
                 <w:szCs w:val="18"/>
               </w:rPr>
-              <w:t xml:space="preserve">Guilherme Trindade Turano — CPF 011.689.716-23 — RG MG 615819613 — casado</w:t>
+              <w:t xml:space="preserve">(38) 98411-5441</w:t>
             </w:r>
           </w:p>
         </w:tc>
@@ -441,7 +441,7 @@
                 <w:sz w:val="15"/>
                 <w:szCs w:val="15"/>
               </w:rPr>
-              <w:t xml:space="preserve">IMÓVEL</w:t>
+              <w:t xml:space="preserve">FIADOR</w:t>
             </w:r>
           </w:p>
         </w:tc>
@@ -462,7 +462,7 @@
                 <w:sz w:val="18"/>
                 <w:szCs w:val="18"/>
               </w:rPr>
-              <w:t xml:space="preserve">Rua Panamá, nº 158, Bairro Esplanada, Montes Claros/MG, CEP 39.401-449</w:t>
+              <w:t xml:space="preserve">Guilherme Trindade Turano — CPF 011.689.716-23 — RG MG 615819613 — casado</w:t>
             </w:r>
           </w:p>
         </w:tc>
@@ -485,7 +485,7 @@
                 <w:sz w:val="15"/>
                 <w:szCs w:val="15"/>
               </w:rPr>
-              <w:t xml:space="preserve">ÁREA TOTAL DO IMÓVEL</w:t>
+              <w:t xml:space="preserve">IMÓVEL</w:t>
             </w:r>
           </w:p>
         </w:tc>
@@ -506,7 +506,7 @@
                 <w:sz w:val="18"/>
                 <w:szCs w:val="18"/>
               </w:rPr>
-              <w:t xml:space="preserve">1.710,00 m²</w:t>
+              <w:t xml:space="preserve">Rua Panamá, nº 158, Bairro Esplanada, Montes Claros/MG, CEP 39.401-449</w:t>
             </w:r>
           </w:p>
         </w:tc>
@@ -529,7 +529,7 @@
                 <w:sz w:val="15"/>
                 <w:szCs w:val="15"/>
               </w:rPr>
-              <w:t xml:space="preserve">ÁREA LOCADA</w:t>
+              <w:t xml:space="preserve">ÁREA TOTAL DO IMÓVEL</w:t>
             </w:r>
           </w:p>
         </w:tc>
@@ -550,7 +550,7 @@
                 <w:sz w:val="18"/>
                 <w:szCs w:val="18"/>
               </w:rPr>
-              <w:t xml:space="preserve">1.430,00 m² (área útil aproximada)</w:t>
+              <w:t xml:space="preserve">1.710,00 m²</w:t>
             </w:r>
           </w:p>
         </w:tc>
@@ -573,7 +573,7 @@
                 <w:sz w:val="15"/>
                 <w:szCs w:val="15"/>
               </w:rPr>
-              <w:t xml:space="preserve">ÁREAS NÃO LOCADAS</w:t>
+              <w:t xml:space="preserve">ÁREA LOCADA</w:t>
             </w:r>
           </w:p>
         </w:tc>
@@ -594,7 +594,7 @@
                 <w:sz w:val="18"/>
                 <w:szCs w:val="18"/>
               </w:rPr>
-              <w:t xml:space="preserve">280,00 m², de uso exclusivo da locadora (Cláusula III)</w:t>
+              <w:t xml:space="preserve">1.430,00 m² (área útil aproximada)</w:t>
             </w:r>
           </w:p>
         </w:tc>
@@ -617,7 +617,7 @@
                 <w:sz w:val="15"/>
                 <w:szCs w:val="15"/>
               </w:rPr>
-              <w:t xml:space="preserve">FINALIDADE</w:t>
+              <w:t xml:space="preserve">ÁREAS NÃO LOCADAS</w:t>
             </w:r>
           </w:p>
         </w:tc>
@@ -638,7 +638,7 @@
                 <w:sz w:val="18"/>
                 <w:szCs w:val="18"/>
               </w:rPr>
-              <w:t xml:space="preserve">Atividades administrativas, armazenamento, apoio operacional e logístico, atividades industriais leves e correlatas à operação da locatária</w:t>
+              <w:t xml:space="preserve">280,00 m², de uso exclusivo da locadora (Cláusula III)</w:t>
             </w:r>
           </w:p>
         </w:tc>
@@ -661,7 +661,7 @@
                 <w:sz w:val="15"/>
                 <w:szCs w:val="15"/>
               </w:rPr>
-              <w:t xml:space="preserve">PRAZO</w:t>
+              <w:t xml:space="preserve">FINALIDADE</w:t>
             </w:r>
           </w:p>
         </w:tc>
@@ -682,7 +682,7 @@
                 <w:sz w:val="18"/>
                 <w:szCs w:val="18"/>
               </w:rPr>
-              <w:t xml:space="preserve">12 (doze) meses — de 10/04/2026 a 10/04/2027</w:t>
+              <w:t xml:space="preserve">Atividades administrativas, armazenamento, apoio operacional e logístico, atividades industriais leves e correlatas à operação da locatária</w:t>
             </w:r>
           </w:p>
         </w:tc>
@@ -705,7 +705,7 @@
                 <w:sz w:val="15"/>
                 <w:szCs w:val="15"/>
               </w:rPr>
-              <w:t xml:space="preserve">ALUGUEL MENSAL</w:t>
+              <w:t xml:space="preserve">PRAZO</w:t>
             </w:r>
           </w:p>
         </w:tc>
@@ -726,7 +726,7 @@
                 <w:sz w:val="18"/>
                 <w:szCs w:val="18"/>
               </w:rPr>
-              <w:t xml:space="preserve">R$ 10.000,00 (dez mil reais)</w:t>
+              <w:t xml:space="preserve">12 (doze) meses — de 10/04/2026 a 10/04/2027</w:t>
             </w:r>
           </w:p>
         </w:tc>
@@ -749,7 +749,7 @@
                 <w:sz w:val="15"/>
                 <w:szCs w:val="15"/>
               </w:rPr>
-              <w:t xml:space="preserve">DESCONTO INICIAL</w:t>
+              <w:t xml:space="preserve">ALUGUEL MENSAL</w:t>
             </w:r>
           </w:p>
         </w:tc>
@@ -770,7 +770,7 @@
                 <w:sz w:val="18"/>
                 <w:szCs w:val="18"/>
               </w:rPr>
-              <w:t xml:space="preserve">50% nos 3 (três) primeiros meses — R$ 5.000,00 (cinco mil reais) por mês</w:t>
+              <w:t xml:space="preserve">R$ 10.000,00 (dez mil reais)</w:t>
             </w:r>
           </w:p>
         </w:tc>
@@ -793,7 +793,7 @@
                 <w:sz w:val="15"/>
                 <w:szCs w:val="15"/>
               </w:rPr>
-              <w:t xml:space="preserve">VENCIMENTO</w:t>
+              <w:t xml:space="preserve">DESCONTO INICIAL</w:t>
             </w:r>
           </w:p>
         </w:tc>
@@ -814,7 +814,7 @@
                 <w:sz w:val="18"/>
                 <w:szCs w:val="18"/>
               </w:rPr>
-              <w:t xml:space="preserve">Todo dia 10 de cada mês</w:t>
+              <w:t xml:space="preserve">50% nos 3 (três) primeiros meses — R$ 5.000,00 (cinco mil reais) por mês</w:t>
             </w:r>
           </w:p>
         </w:tc>
@@ -837,7 +837,7 @@
                 <w:sz w:val="15"/>
                 <w:szCs w:val="15"/>
               </w:rPr>
-              <w:t xml:space="preserve">FORMA DE PAGAMENTO</w:t>
+              <w:t xml:space="preserve">VENCIMENTO</w:t>
             </w:r>
           </w:p>
         </w:tc>
@@ -858,7 +858,7 @@
                 <w:sz w:val="18"/>
                 <w:szCs w:val="18"/>
               </w:rPr>
-              <w:t xml:space="preserve">Depósito bancário em favor de Heitor de Freitas Froes — [banco, agência e conta]</w:t>
+              <w:t xml:space="preserve">Todo dia 10 de cada mês</w:t>
             </w:r>
           </w:p>
         </w:tc>
@@ -881,7 +881,7 @@
                 <w:sz w:val="15"/>
                 <w:szCs w:val="15"/>
               </w:rPr>
-              <w:t xml:space="preserve">REAJUSTE</w:t>
+              <w:t xml:space="preserve">FORMA DE PAGAMENTO</w:t>
             </w:r>
           </w:p>
         </w:tc>
@@ -902,7 +902,7 @@
                 <w:sz w:val="18"/>
                 <w:szCs w:val="18"/>
               </w:rPr>
-              <w:t xml:space="preserve">Anual, pelo menor índice positivo entre IPCA e IGP-M</w:t>
+              <w:t xml:space="preserve">Depósito bancário em favor de Heitor de Freitas Froes — Sicoob Engecred, agência 3299, conta 46052-4</w:t>
             </w:r>
           </w:p>
         </w:tc>
@@ -925,7 +925,7 @@
                 <w:sz w:val="15"/>
                 <w:szCs w:val="15"/>
               </w:rPr>
-              <w:t xml:space="preserve">ANEXOS</w:t>
+              <w:t xml:space="preserve">REAJUSTE</w:t>
             </w:r>
           </w:p>
         </w:tc>
@@ -946,6 +946,50 @@
                 <w:sz w:val="18"/>
                 <w:szCs w:val="18"/>
               </w:rPr>
+              <w:t xml:space="preserve">Anual, pelo menor índice positivo entre IPCA e IGP-M</w:t>
+            </w:r>
+          </w:p>
+        </w:tc>
+      </w:tr>
+      <w:tr>
+        <w:tc>
+          <w:tcPr>
+            <w:tcW w:w="2948" w:type="dxa"/>
+            <w:vAlign w:val="top"/>
+          </w:tcPr>
+          <w:p>
+            <w:pPr>
+              <w:spacing w:before="0" w:after="120" w:line="240" w:lineRule="auto"/>
+              <w:jc w:val="left"/>
+            </w:pPr>
+            <w:r>
+              <w:rPr>
+                <w:rFonts w:ascii="Consolas" w:hAnsi="Consolas" w:cs="Consolas"/>
+                <w:color w:val="8B6449"/>
+                <w:sz w:val="15"/>
+                <w:szCs w:val="15"/>
+              </w:rPr>
+              <w:t xml:space="preserve">ANEXOS</w:t>
+            </w:r>
+          </w:p>
+        </w:tc>
+        <w:tc>
+          <w:tcPr>
+            <w:tcW w:w="6690" w:type="dxa"/>
+            <w:vAlign w:val="top"/>
+          </w:tcPr>
+          <w:p>
+            <w:pPr>
+              <w:spacing w:before="0" w:after="120" w:line="240" w:lineRule="auto"/>
+              <w:jc w:val="left"/>
+            </w:pPr>
+            <w:r>
+              <w:rPr>
+                <w:rFonts w:ascii="Calibri" w:hAnsi="Calibri" w:cs="Calibri"/>
+                <w:color w:val="2B2723"/>
+                <w:sz w:val="18"/>
+                <w:szCs w:val="18"/>
+              </w:rPr>
               <w:t xml:space="preserve">I — Relatório de avaliação do valor de mercado do aluguel; II — Memorial descritivo das áreas; III — Laudo de vistoria inicial</w:t>
             </w:r>
           </w:p>
@@ -1002,7 +1046,7 @@
           <w:sz w:val="20"/>
           <w:szCs w:val="20"/>
         </w:rPr>
-        <w:t xml:space="preserve">LOCATÁRIA: TURANO CONSTRUTORA LTDA, inscrita no CNPJ sob o nº 12.575.065/0001-44, com sede na Av. Doutor José Corrêa Machado, nº 1079, Bloco C, 1º andar, Sala 102, Montes Claros/MG, CEP 39.401-832, telefone (38) 98411-5441, neste ato representada por [nome do representante legal], inscrito(a) no CPF sob o nº [_____], doravante denominada LOCATÁRIA;</w:t>
+        <w:t xml:space="preserve">LOCATÁRIA: TURANO CONSTRUTORA LTDA, inscrita no CNPJ sob o nº 12.575.065/0001-44, com sede na Av. Doutor José Corrêa Machado, nº 1079, Bloco C, 1º andar, Sala 102, Montes Claros/MG, CEP 39.401-832, telefone (38) 98411-5441, neste ato representada por GUILHERME TRINDADE TURANO, inscrito no CPF sob o nº 011.689.716-23, portador do RG nº MG 615819613, doravante denominada LOCATÁRIA;</w:t>
       </w:r>
     </w:p>
     <w:p>
@@ -2090,7 +2134,7 @@
           <w:sz w:val="20"/>
           <w:szCs w:val="20"/>
         </w:rPr>
-        <w:t xml:space="preserve">O aluguel deverá ser pago até o dia 10 (dez) de cada mês, mediante depósito bancário em favor de HEITOR DE FREITAS FROES, na conta [banco, agência e conta].</w:t>
+        <w:t xml:space="preserve">O aluguel deverá ser pago até o dia 10 (dez) de cada mês, mediante depósito bancário em favor de HEITOR DE FREITAS FROES, no Sicoob Engecred, agência 3299, conta 46052-4.</w:t>
       </w:r>
     </w:p>
     <w:p>
@@ -3367,7 +3411,7 @@
           <w:sz w:val="20"/>
           <w:szCs w:val="20"/>
         </w:rPr>
-        <w:t xml:space="preserve">E, por estarem assim justas e contratadas, as partes assinam o presente instrumento em 3 (três) vias de igual teor e forma, na presença das testemunhas abaixo.</w:t>
+        <w:t xml:space="preserve">E, por estarem assim justas e contratadas, as partes assinam o presente instrumento em 3 (três) vias de igual teor e forma, para que produza seus efeitos legais.</w:t>
       </w:r>
     </w:p>
     <w:p>
@@ -3384,7 +3428,7 @@
           <w:sz w:val="20"/>
           <w:szCs w:val="20"/>
         </w:rPr>
-        <w:t xml:space="preserve">Montes Claros/MG, ____ de ____________________ de 2026.</w:t>
+        <w:t xml:space="preserve">Montes Claros/MG, 14 de outubro de 2026.</w:t>
       </w:r>
     </w:p>
     <w:p>
@@ -3520,7 +3564,7 @@
           <w:sz w:val="16"/>
           <w:szCs w:val="16"/>
         </w:rPr>
-        <w:t xml:space="preserve">p. [representante legal]</w:t>
+        <w:t xml:space="preserve">p. Guilherme Trindade Turano — representante</w:t>
       </w:r>
     </w:p>
     <w:p>
@@ -3606,108 +3650,6 @@
           <w:szCs w:val="14"/>
         </w:rPr>
         <w:t xml:space="preserve">CÔNJUGE DO FIADOR (ANUÊNCIA À FIANÇA)</w:t>
-      </w:r>
-    </w:p>
-    <w:p>
-      <w:pPr>
-        <w:keepNext/>
-        <w:keepLines/>
-        <w:spacing w:before="0" w:after="120" w:line="276" w:lineRule="auto"/>
-        <w:jc w:val="left"/>
-      </w:pPr>
-      <w:r>
-        <w:rPr>
-          <w:rFonts w:ascii="Calibri" w:hAnsi="Calibri" w:cs="Calibri"/>
-          <w:color w:val="2B2723"/>
-          <w:sz w:val="18"/>
-          <w:szCs w:val="18"/>
-        </w:rPr>
-        <w:t xml:space="preserve">[nome] — CPF [_____]</w:t>
-      </w:r>
-    </w:p>
-    <w:p>
-      <w:pPr>
-        <w:keepNext/>
-        <w:keepLines/>
-        <w:spacing w:before="280" w:after="40" w:line="276" w:lineRule="auto"/>
-        <w:jc w:val="left"/>
-      </w:pPr>
-      <w:r>
-        <w:rPr>
-          <w:rFonts w:ascii="Calibri" w:hAnsi="Calibri" w:cs="Calibri"/>
-          <w:color w:val="2B2723"/>
-          <w:sz w:val="20"/>
-          <w:szCs w:val="20"/>
-        </w:rPr>
-        <w:t xml:space="preserve">______________________________________________________</w:t>
-      </w:r>
-    </w:p>
-    <w:p>
-      <w:pPr>
-        <w:keepNext/>
-        <w:keepLines/>
-        <w:spacing w:before="0" w:after="20" w:line="276" w:lineRule="auto"/>
-        <w:jc w:val="left"/>
-      </w:pPr>
-      <w:r>
-        <w:rPr>
-          <w:rFonts w:ascii="Consolas" w:hAnsi="Consolas" w:cs="Consolas"/>
-          <w:color w:val="8B6449"/>
-          <w:sz w:val="14"/>
-          <w:szCs w:val="14"/>
-        </w:rPr>
-        <w:t xml:space="preserve">TESTEMUNHA</w:t>
-      </w:r>
-    </w:p>
-    <w:p>
-      <w:pPr>
-        <w:keepNext/>
-        <w:keepLines/>
-        <w:spacing w:before="0" w:after="120" w:line="276" w:lineRule="auto"/>
-        <w:jc w:val="left"/>
-      </w:pPr>
-      <w:r>
-        <w:rPr>
-          <w:rFonts w:ascii="Calibri" w:hAnsi="Calibri" w:cs="Calibri"/>
-          <w:color w:val="2B2723"/>
-          <w:sz w:val="18"/>
-          <w:szCs w:val="18"/>
-        </w:rPr>
-        <w:t xml:space="preserve">[nome] — CPF [_____]</w:t>
-      </w:r>
-    </w:p>
-    <w:p>
-      <w:pPr>
-        <w:keepNext/>
-        <w:keepLines/>
-        <w:spacing w:before="280" w:after="40" w:line="276" w:lineRule="auto"/>
-        <w:jc w:val="left"/>
-      </w:pPr>
-      <w:r>
-        <w:rPr>
-          <w:rFonts w:ascii="Calibri" w:hAnsi="Calibri" w:cs="Calibri"/>
-          <w:color w:val="2B2723"/>
-          <w:sz w:val="20"/>
-          <w:szCs w:val="20"/>
-        </w:rPr>
-        <w:t xml:space="preserve">______________________________________________________</w:t>
-      </w:r>
-    </w:p>
-    <w:p>
-      <w:pPr>
-        <w:keepNext/>
-        <w:keepLines/>
-        <w:spacing w:before="0" w:after="20" w:line="276" w:lineRule="auto"/>
-        <w:jc w:val="left"/>
-      </w:pPr>
-      <w:r>
-        <w:rPr>
-          <w:rFonts w:ascii="Consolas" w:hAnsi="Consolas" w:cs="Consolas"/>
-          <w:color w:val="8B6449"/>
-          <w:sz w:val="14"/>
-          <w:szCs w:val="14"/>
-        </w:rPr>
-        <w:t xml:space="preserve">TESTEMUNHA</w:t>
       </w:r>
     </w:p>
     <w:p>

</xml_diff>

<commit_message>
Retira o desconto inicial do contrato de locação Turano
Sai a linha "Desconto inicial" do quadro-resumo e o parágrafo que concedia
50% nos três primeiros meses. A cláusula VIII passa a se chamar "Do aluguel
e do reajuste", com o reajuste como parágrafo único.

Co-Authored-By: Claude Opus 5.5 <noreply@anthropic.com>
Claude-Session: https://claude.ai/code/session_01QmJkyFBvaZw2weqiJS9pRm
</commit_message>
<xml_diff>
--- a/contratos/locacao-galpao-turano/Contrato de locacao - Galpao Rua Panama 158 - Turano Construtora.docx
+++ b/contratos/locacao-galpao-turano/Contrato de locacao - Galpao Rua Panama 158 - Turano Construtora.docx
@@ -793,50 +793,6 @@
                 <w:sz w:val="15"/>
                 <w:szCs w:val="15"/>
               </w:rPr>
-              <w:t xml:space="preserve">DESCONTO INICIAL</w:t>
-            </w:r>
-          </w:p>
-        </w:tc>
-        <w:tc>
-          <w:tcPr>
-            <w:tcW w:w="6690" w:type="dxa"/>
-            <w:vAlign w:val="top"/>
-          </w:tcPr>
-          <w:p>
-            <w:pPr>
-              <w:spacing w:before="0" w:after="120" w:line="240" w:lineRule="auto"/>
-              <w:jc w:val="left"/>
-            </w:pPr>
-            <w:r>
-              <w:rPr>
-                <w:rFonts w:ascii="Calibri" w:hAnsi="Calibri" w:cs="Calibri"/>
-                <w:color w:val="2B2723"/>
-                <w:sz w:val="18"/>
-                <w:szCs w:val="18"/>
-              </w:rPr>
-              <w:t xml:space="preserve">50% nos 3 (três) primeiros meses — R$ 5.000,00 (cinco mil reais) por mês</w:t>
-            </w:r>
-          </w:p>
-        </w:tc>
-      </w:tr>
-      <w:tr>
-        <w:tc>
-          <w:tcPr>
-            <w:tcW w:w="2948" w:type="dxa"/>
-            <w:vAlign w:val="top"/>
-          </w:tcPr>
-          <w:p>
-            <w:pPr>
-              <w:spacing w:before="0" w:after="120" w:line="240" w:lineRule="auto"/>
-              <w:jc w:val="left"/>
-            </w:pPr>
-            <w:r>
-              <w:rPr>
-                <w:rFonts w:ascii="Consolas" w:hAnsi="Consolas" w:cs="Consolas"/>
-                <w:color w:val="8B6449"/>
-                <w:sz w:val="15"/>
-                <w:szCs w:val="15"/>
-              </w:rPr>
               <w:t xml:space="preserve">VENCIMENTO</w:t>
             </w:r>
           </w:p>
@@ -2054,7 +2010,7 @@
           <w:sz w:val="20"/>
           <w:szCs w:val="20"/>
         </w:rPr>
-        <w:t xml:space="preserve">VIII — DO ALUGUEL, DO DESCONTO INICIAL E DO REAJUSTE</w:t>
+        <w:t xml:space="preserve">VIII — DO ALUGUEL E DO REAJUSTE</w:t>
       </w:r>
     </w:p>
     <w:p>
@@ -2085,23 +2041,7 @@
           <w:sz w:val="19"/>
           <w:szCs w:val="19"/>
         </w:rPr>
-        <w:t xml:space="preserve">Parágrafo primeiro — Será concedido desconto de 50% (cinquenta por cento) sobre o aluguel nos 3 (três) primeiros meses da locação, período em que o aluguel mensal será de R$ 5.000,00 (cinco mil reais).</w:t>
-      </w:r>
-    </w:p>
-    <w:p>
-      <w:pPr>
-        <w:spacing w:before="0" w:after="140" w:line="276" w:lineRule="auto"/>
-        <w:ind w:left="340"/>
-        <w:jc w:val="both"/>
-      </w:pPr>
-      <w:r>
-        <w:rPr>
-          <w:rFonts w:ascii="Calibri" w:hAnsi="Calibri" w:cs="Calibri"/>
-          <w:color w:val="55504A"/>
-          <w:sz w:val="19"/>
-          <w:szCs w:val="19"/>
-        </w:rPr>
-        <w:t xml:space="preserve">Parágrafo segundo — O aluguel será reajustado anualmente pelo menor índice positivo entre o IPCA e o IGP-M.</w:t>
+        <w:t xml:space="preserve">Parágrafo único — O aluguel será reajustado anualmente pelo menor índice positivo entre o IPCA e o IGP-M.</w:t>
       </w:r>
     </w:p>
     <w:p>

</xml_diff>